<commit_message>
Add seed stability sweep and tests
</commit_message>
<xml_diff>
--- a/Report Draft/Appendix-A-Methodology-Tables.docx
+++ b/Report Draft/Appendix-A-Methodology-Tables.docx
@@ -5870,7 +5870,834 @@
           <w:sz w:val="19"/>
           <w:szCs w:val="19"/>
         </w:rPr>
-        <w:t>Table A.4  Minimum computational requirements, derived from the architectures of Section 3.4.</w:t>
+        <w:t>Table A.4  Settings of the evaluation procedures. Table 3.4 states what each procedure establishes and cites its source; this table fixes the values at which each was run.</w:t>
+      </w:r>
+    </w:p>
+    <w:tbl>
+      <w:tblPr>
+        <w:tblW w:type="dxa" w:w="9026"/>
+        <w:tblBorders>
+          <w:top w:val="single" w:color="auto" w:sz="4"/>
+          <w:left w:val="single" w:color="auto" w:sz="4"/>
+          <w:bottom w:val="single" w:color="auto" w:sz="4"/>
+          <w:right w:val="single" w:color="auto" w:sz="4"/>
+          <w:insideH w:val="single" w:color="auto" w:sz="4"/>
+          <w:insideV w:val="single" w:color="auto" w:sz="4"/>
+        </w:tblBorders>
+      </w:tblPr>
+      <w:tblGrid>
+        <w:gridCol w:w="2400"/>
+        <w:gridCol w:w="6626"/>
+      </w:tblGrid>
+      <w:tr>
+        <w:trPr>
+          <w:cantSplit/>
+          <w:tblHeader/>
+        </w:trPr>
+        <w:tc>
+          <w:tcPr>
+            <w:tcW w:type="dxa" w:w="2400"/>
+            <w:tcBorders>
+              <w:top w:val="single" w:color="111111" w:sz="4"/>
+              <w:left w:val="none" w:color="FFFFFF" w:sz="0"/>
+              <w:bottom w:val="single" w:color="111111" w:sz="4"/>
+              <w:right w:val="none" w:color="FFFFFF" w:sz="0"/>
+            </w:tcBorders>
+            <w:shd w:fill="F2F2F2" w:color="auto" w:val="clear"/>
+            <w:tcMar>
+              <w:top w:type="dxa" w:w="70"/>
+              <w:left w:type="dxa" w:w="110"/>
+              <w:bottom w:type="dxa" w:w="70"/>
+              <w:right w:type="dxa" w:w="110"/>
+            </w:tcMar>
+          </w:tcPr>
+          <w:p>
+            <w:pPr>
+              <w:spacing w:after="0" w:line="260"/>
+            </w:pPr>
+            <w:r>
+              <w:rPr>
+                <w:rFonts w:ascii="Calibri" w:cs="Calibri" w:eastAsia="Calibri" w:hAnsi="Calibri"/>
+                <w:b/>
+                <w:bCs/>
+                <w:color w:val="111111"/>
+                <w:sz w:val="18"/>
+                <w:szCs w:val="18"/>
+              </w:rPr>
+              <w:t xml:space="preserve">Procedure</w:t>
+            </w:r>
+          </w:p>
+        </w:tc>
+        <w:tc>
+          <w:tcPr>
+            <w:tcW w:type="dxa" w:w="6626"/>
+            <w:tcBorders>
+              <w:top w:val="single" w:color="111111" w:sz="4"/>
+              <w:left w:val="none" w:color="FFFFFF" w:sz="0"/>
+              <w:bottom w:val="single" w:color="111111" w:sz="4"/>
+              <w:right w:val="none" w:color="FFFFFF" w:sz="0"/>
+            </w:tcBorders>
+            <w:shd w:fill="F2F2F2" w:color="auto" w:val="clear"/>
+            <w:tcMar>
+              <w:top w:type="dxa" w:w="70"/>
+              <w:left w:type="dxa" w:w="110"/>
+              <w:bottom w:type="dxa" w:w="70"/>
+              <w:right w:type="dxa" w:w="110"/>
+            </w:tcMar>
+          </w:tcPr>
+          <w:p>
+            <w:pPr>
+              <w:spacing w:after="0" w:line="260"/>
+            </w:pPr>
+            <w:r>
+              <w:rPr>
+                <w:rFonts w:ascii="Calibri" w:cs="Calibri" w:eastAsia="Calibri" w:hAnsi="Calibri"/>
+                <w:b/>
+                <w:bCs/>
+                <w:color w:val="111111"/>
+                <w:sz w:val="18"/>
+                <w:szCs w:val="18"/>
+              </w:rPr>
+              <w:t xml:space="preserve">Settings as configured</w:t>
+            </w:r>
+          </w:p>
+        </w:tc>
+      </w:tr>
+      <w:tr>
+        <w:trPr>
+          <w:cantSplit/>
+          <w:tblHeader w:val="false"/>
+        </w:trPr>
+        <w:tc>
+          <w:tcPr>
+            <w:tcW w:type="dxa" w:w="2400"/>
+            <w:tcBorders>
+              <w:top w:val="none" w:color="FFFFFF" w:sz="0"/>
+              <w:left w:val="none" w:color="FFFFFF" w:sz="0"/>
+              <w:bottom w:val="single" w:color="BFBFBF" w:sz="4"/>
+              <w:right w:val="none" w:color="FFFFFF" w:sz="0"/>
+            </w:tcBorders>
+            <w:tcMar>
+              <w:top w:type="dxa" w:w="70"/>
+              <w:left w:type="dxa" w:w="110"/>
+              <w:bottom w:type="dxa" w:w="70"/>
+              <w:right w:type="dxa" w:w="110"/>
+            </w:tcMar>
+          </w:tcPr>
+          <w:p>
+            <w:pPr>
+              <w:spacing w:after="0" w:line="260"/>
+            </w:pPr>
+            <w:r>
+              <w:rPr>
+                <w:rFonts w:ascii="Calibri" w:cs="Calibri" w:eastAsia="Calibri" w:hAnsi="Calibri"/>
+                <w:b w:val="false"/>
+                <w:bCs w:val="false"/>
+                <w:color w:val="444444"/>
+                <w:sz w:val="18"/>
+                <w:szCs w:val="18"/>
+              </w:rPr>
+              <w:t xml:space="preserve">Loss computation</w:t>
+            </w:r>
+          </w:p>
+        </w:tc>
+        <w:tc>
+          <w:tcPr>
+            <w:tcW w:type="dxa" w:w="6626"/>
+            <w:tcBorders>
+              <w:top w:val="none" w:color="FFFFFF" w:sz="0"/>
+              <w:left w:val="none" w:color="FFFFFF" w:sz="0"/>
+              <w:bottom w:val="single" w:color="BFBFBF" w:sz="4"/>
+              <w:right w:val="none" w:color="FFFFFF" w:sz="0"/>
+            </w:tcBorders>
+            <w:tcMar>
+              <w:top w:type="dxa" w:w="70"/>
+              <w:left w:type="dxa" w:w="110"/>
+              <w:bottom w:type="dxa" w:w="70"/>
+              <w:right w:type="dxa" w:w="110"/>
+            </w:tcMar>
+          </w:tcPr>
+          <w:p>
+            <w:pPr>
+              <w:spacing w:after="0" w:line="260"/>
+            </w:pPr>
+            <w:r>
+              <w:rPr>
+                <w:rFonts w:ascii="Calibri" w:cs="Calibri" w:eastAsia="Calibri" w:hAnsi="Calibri"/>
+                <w:b w:val="false"/>
+                <w:bCs w:val="false"/>
+                <w:color w:val="444444"/>
+                <w:sz w:val="18"/>
+                <w:szCs w:val="18"/>
+              </w:rPr>
+              <w:t xml:space="preserve">QLIKE primary, MSE secondary; both arguments floored at 1e-16 before any logarithm or division.</w:t>
+            </w:r>
+          </w:p>
+        </w:tc>
+      </w:tr>
+      <w:tr>
+        <w:trPr>
+          <w:cantSplit/>
+          <w:tblHeader w:val="false"/>
+        </w:trPr>
+        <w:tc>
+          <w:tcPr>
+            <w:tcW w:type="dxa" w:w="2400"/>
+            <w:tcBorders>
+              <w:top w:val="none" w:color="FFFFFF" w:sz="0"/>
+              <w:left w:val="none" w:color="FFFFFF" w:sz="0"/>
+              <w:bottom w:val="single" w:color="BFBFBF" w:sz="4"/>
+              <w:right w:val="none" w:color="FFFFFF" w:sz="0"/>
+            </w:tcBorders>
+            <w:tcMar>
+              <w:top w:type="dxa" w:w="70"/>
+              <w:left w:type="dxa" w:w="110"/>
+              <w:bottom w:type="dxa" w:w="70"/>
+              <w:right w:type="dxa" w:w="110"/>
+            </w:tcMar>
+          </w:tcPr>
+          <w:p>
+            <w:pPr>
+              <w:spacing w:after="0" w:line="260"/>
+            </w:pPr>
+            <w:r>
+              <w:rPr>
+                <w:rFonts w:ascii="Calibri" w:cs="Calibri" w:eastAsia="Calibri" w:hAnsi="Calibri"/>
+                <w:b w:val="false"/>
+                <w:bCs w:val="false"/>
+                <w:color w:val="444444"/>
+                <w:sz w:val="18"/>
+                <w:szCs w:val="18"/>
+              </w:rPr>
+              <w:t xml:space="preserve">Diebold–Mariano</w:t>
+            </w:r>
+          </w:p>
+        </w:tc>
+        <w:tc>
+          <w:tcPr>
+            <w:tcW w:type="dxa" w:w="6626"/>
+            <w:tcBorders>
+              <w:top w:val="none" w:color="FFFFFF" w:sz="0"/>
+              <w:left w:val="none" w:color="FFFFFF" w:sz="0"/>
+              <w:bottom w:val="single" w:color="BFBFBF" w:sz="4"/>
+              <w:right w:val="none" w:color="FFFFFF" w:sz="0"/>
+            </w:tcBorders>
+            <w:tcMar>
+              <w:top w:type="dxa" w:w="70"/>
+              <w:left w:type="dxa" w:w="110"/>
+              <w:bottom w:type="dxa" w:w="70"/>
+              <w:right w:type="dxa" w:w="110"/>
+            </w:tcMar>
+          </w:tcPr>
+          <w:p>
+            <w:pPr>
+              <w:spacing w:after="0" w:line="260"/>
+            </w:pPr>
+            <w:r>
+              <w:rPr>
+                <w:rFonts w:ascii="Calibri" w:cs="Calibri" w:eastAsia="Calibri" w:hAnsi="Calibri"/>
+                <w:b w:val="false"/>
+                <w:bCs w:val="false"/>
+                <w:color w:val="444444"/>
+                <w:sz w:val="18"/>
+                <w:szCs w:val="18"/>
+              </w:rPr>
+              <w:t xml:space="preserve">Newey–West Bartlett long-run variance, the lag the larger of h − 1 and the integer part of the cube root of n, hence 9 at n = 784; Harvey–Leybourne–Newbold small-sample rescaling; two-sided Student-t on n − 1 degrees of freedom. The lag is swept from 0 to 30 as a sensitivity.</w:t>
+            </w:r>
+          </w:p>
+        </w:tc>
+      </w:tr>
+      <w:tr>
+        <w:trPr>
+          <w:cantSplit/>
+          <w:tblHeader w:val="false"/>
+        </w:trPr>
+        <w:tc>
+          <w:tcPr>
+            <w:tcW w:type="dxa" w:w="2400"/>
+            <w:tcBorders>
+              <w:top w:val="none" w:color="FFFFFF" w:sz="0"/>
+              <w:left w:val="none" w:color="FFFFFF" w:sz="0"/>
+              <w:bottom w:val="single" w:color="BFBFBF" w:sz="4"/>
+              <w:right w:val="none" w:color="FFFFFF" w:sz="0"/>
+            </w:tcBorders>
+            <w:tcMar>
+              <w:top w:type="dxa" w:w="70"/>
+              <w:left w:type="dxa" w:w="110"/>
+              <w:bottom w:type="dxa" w:w="70"/>
+              <w:right w:type="dxa" w:w="110"/>
+            </w:tcMar>
+          </w:tcPr>
+          <w:p>
+            <w:pPr>
+              <w:spacing w:after="0" w:line="260"/>
+            </w:pPr>
+            <w:r>
+              <w:rPr>
+                <w:rFonts w:ascii="Calibri" w:cs="Calibri" w:eastAsia="Calibri" w:hAnsi="Calibri"/>
+                <w:b w:val="false"/>
+                <w:bCs w:val="false"/>
+                <w:color w:val="444444"/>
+                <w:sz w:val="18"/>
+                <w:szCs w:val="18"/>
+              </w:rPr>
+              <w:t xml:space="preserve">Giacomini–White</w:t>
+            </w:r>
+          </w:p>
+        </w:tc>
+        <w:tc>
+          <w:tcPr>
+            <w:tcW w:type="dxa" w:w="6626"/>
+            <w:tcBorders>
+              <w:top w:val="none" w:color="FFFFFF" w:sz="0"/>
+              <w:left w:val="none" w:color="FFFFFF" w:sz="0"/>
+              <w:bottom w:val="single" w:color="BFBFBF" w:sz="4"/>
+              <w:right w:val="none" w:color="FFFFFF" w:sz="0"/>
+            </w:tcBorders>
+            <w:tcMar>
+              <w:top w:type="dxa" w:w="70"/>
+              <w:left w:type="dxa" w:w="110"/>
+              <w:bottom w:type="dxa" w:w="70"/>
+              <w:right w:type="dxa" w:w="110"/>
+            </w:tcMar>
+          </w:tcPr>
+          <w:p>
+            <w:pPr>
+              <w:spacing w:after="0" w:line="260"/>
+            </w:pPr>
+            <w:r>
+              <w:rPr>
+                <w:rFonts w:ascii="Calibri" w:cs="Calibri" w:eastAsia="Calibri" w:hAnsi="Calibri"/>
+                <w:b w:val="false"/>
+                <w:bCs w:val="false"/>
+                <w:color w:val="444444"/>
+                <w:sz w:val="18"/>
+                <w:szCs w:val="18"/>
+              </w:rPr>
+              <w:t xml:space="preserve">Conditioning set the three t−1 regime indicators, or a constant with the lagged loss differential; horizon 1, so no HAC lag. The long-run covariance is mean-centred, with the uncentred estimator reported beside it.</w:t>
+            </w:r>
+          </w:p>
+        </w:tc>
+      </w:tr>
+      <w:tr>
+        <w:trPr>
+          <w:cantSplit/>
+          <w:tblHeader w:val="false"/>
+        </w:trPr>
+        <w:tc>
+          <w:tcPr>
+            <w:tcW w:type="dxa" w:w="2400"/>
+            <w:tcBorders>
+              <w:top w:val="none" w:color="FFFFFF" w:sz="0"/>
+              <w:left w:val="none" w:color="FFFFFF" w:sz="0"/>
+              <w:bottom w:val="single" w:color="BFBFBF" w:sz="4"/>
+              <w:right w:val="none" w:color="FFFFFF" w:sz="0"/>
+            </w:tcBorders>
+            <w:tcMar>
+              <w:top w:type="dxa" w:w="70"/>
+              <w:left w:type="dxa" w:w="110"/>
+              <w:bottom w:type="dxa" w:w="70"/>
+              <w:right w:type="dxa" w:w="110"/>
+            </w:tcMar>
+          </w:tcPr>
+          <w:p>
+            <w:pPr>
+              <w:spacing w:after="0" w:line="260"/>
+            </w:pPr>
+            <w:r>
+              <w:rPr>
+                <w:rFonts w:ascii="Calibri" w:cs="Calibri" w:eastAsia="Calibri" w:hAnsi="Calibri"/>
+                <w:b w:val="false"/>
+                <w:bCs w:val="false"/>
+                <w:color w:val="444444"/>
+                <w:sz w:val="18"/>
+                <w:szCs w:val="18"/>
+              </w:rPr>
+              <w:t xml:space="preserve">Model Confidence Set</w:t>
+            </w:r>
+          </w:p>
+        </w:tc>
+        <w:tc>
+          <w:tcPr>
+            <w:tcW w:type="dxa" w:w="6626"/>
+            <w:tcBorders>
+              <w:top w:val="none" w:color="FFFFFF" w:sz="0"/>
+              <w:left w:val="none" w:color="FFFFFF" w:sz="0"/>
+              <w:bottom w:val="single" w:color="BFBFBF" w:sz="4"/>
+              <w:right w:val="none" w:color="FFFFFF" w:sz="0"/>
+            </w:tcBorders>
+            <w:tcMar>
+              <w:top w:type="dxa" w:w="70"/>
+              <w:left w:type="dxa" w:w="110"/>
+              <w:bottom w:type="dxa" w:w="70"/>
+              <w:right w:type="dxa" w:w="110"/>
+            </w:tcMar>
+          </w:tcPr>
+          <w:p>
+            <w:pPr>
+              <w:spacing w:after="0" w:line="260"/>
+            </w:pPr>
+            <w:r>
+              <w:rPr>
+                <w:rFonts w:ascii="Calibri" w:cs="Calibri" w:eastAsia="Calibri" w:hAnsi="Calibri"/>
+                <w:b w:val="false"/>
+                <w:bCs w:val="false"/>
+                <w:color w:val="444444"/>
+                <w:sz w:val="18"/>
+                <w:szCs w:val="18"/>
+              </w:rPr>
+              <w:t xml:space="preserve">α = 0.10; range elimination statistic; stationary bootstrap, 2,000 replications, expected block length 10, seed 17.</w:t>
+            </w:r>
+          </w:p>
+        </w:tc>
+      </w:tr>
+      <w:tr>
+        <w:trPr>
+          <w:cantSplit/>
+          <w:tblHeader w:val="false"/>
+        </w:trPr>
+        <w:tc>
+          <w:tcPr>
+            <w:tcW w:type="dxa" w:w="2400"/>
+            <w:tcBorders>
+              <w:top w:val="none" w:color="FFFFFF" w:sz="0"/>
+              <w:left w:val="none" w:color="FFFFFF" w:sz="0"/>
+              <w:bottom w:val="single" w:color="BFBFBF" w:sz="4"/>
+              <w:right w:val="none" w:color="FFFFFF" w:sz="0"/>
+            </w:tcBorders>
+            <w:tcMar>
+              <w:top w:type="dxa" w:w="70"/>
+              <w:left w:type="dxa" w:w="110"/>
+              <w:bottom w:type="dxa" w:w="70"/>
+              <w:right w:type="dxa" w:w="110"/>
+            </w:tcMar>
+          </w:tcPr>
+          <w:p>
+            <w:pPr>
+              <w:spacing w:after="0" w:line="260"/>
+            </w:pPr>
+            <w:r>
+              <w:rPr>
+                <w:rFonts w:ascii="Calibri" w:cs="Calibri" w:eastAsia="Calibri" w:hAnsi="Calibri"/>
+                <w:b w:val="false"/>
+                <w:bCs w:val="false"/>
+                <w:color w:val="444444"/>
+                <w:sz w:val="18"/>
+                <w:szCs w:val="18"/>
+              </w:rPr>
+              <w:t xml:space="preserve">Interval levels</w:t>
+            </w:r>
+          </w:p>
+        </w:tc>
+        <w:tc>
+          <w:tcPr>
+            <w:tcW w:type="dxa" w:w="6626"/>
+            <w:tcBorders>
+              <w:top w:val="none" w:color="FFFFFF" w:sz="0"/>
+              <w:left w:val="none" w:color="FFFFFF" w:sz="0"/>
+              <w:bottom w:val="single" w:color="BFBFBF" w:sz="4"/>
+              <w:right w:val="none" w:color="FFFFFF" w:sz="0"/>
+            </w:tcBorders>
+            <w:tcMar>
+              <w:top w:type="dxa" w:w="70"/>
+              <w:left w:type="dxa" w:w="110"/>
+              <w:bottom w:type="dxa" w:w="70"/>
+              <w:right w:type="dxa" w:w="110"/>
+            </w:tcMar>
+          </w:tcPr>
+          <w:p>
+            <w:pPr>
+              <w:spacing w:after="0" w:line="260"/>
+            </w:pPr>
+            <w:r>
+              <w:rPr>
+                <w:rFonts w:ascii="Calibri" w:cs="Calibri" w:eastAsia="Calibri" w:hAnsi="Calibri"/>
+                <w:b w:val="false"/>
+                <w:bCs w:val="false"/>
+                <w:color w:val="444444"/>
+                <w:sz w:val="18"/>
+                <w:szCs w:val="18"/>
+              </w:rPr>
+              <w:t xml:space="preserve">90% headline; 95% additionally for the methods stating a predictive law; endpoints floored at 1e-14 on the variance scale.</w:t>
+            </w:r>
+          </w:p>
+        </w:tc>
+      </w:tr>
+      <w:tr>
+        <w:trPr>
+          <w:cantSplit/>
+          <w:tblHeader w:val="false"/>
+        </w:trPr>
+        <w:tc>
+          <w:tcPr>
+            <w:tcW w:type="dxa" w:w="2400"/>
+            <w:tcBorders>
+              <w:top w:val="none" w:color="FFFFFF" w:sz="0"/>
+              <w:left w:val="none" w:color="FFFFFF" w:sz="0"/>
+              <w:bottom w:val="single" w:color="BFBFBF" w:sz="4"/>
+              <w:right w:val="none" w:color="FFFFFF" w:sz="0"/>
+            </w:tcBorders>
+            <w:tcMar>
+              <w:top w:type="dxa" w:w="70"/>
+              <w:left w:type="dxa" w:w="110"/>
+              <w:bottom w:type="dxa" w:w="70"/>
+              <w:right w:type="dxa" w:w="110"/>
+            </w:tcMar>
+          </w:tcPr>
+          <w:p>
+            <w:pPr>
+              <w:spacing w:after="0" w:line="260"/>
+            </w:pPr>
+            <w:r>
+              <w:rPr>
+                <w:rFonts w:ascii="Calibri" w:cs="Calibri" w:eastAsia="Calibri" w:hAnsi="Calibri"/>
+                <w:b w:val="false"/>
+                <w:bCs w:val="false"/>
+                <w:color w:val="444444"/>
+                <w:sz w:val="18"/>
+                <w:szCs w:val="18"/>
+              </w:rPr>
+              <w:t xml:space="preserve">Coverage backtests</w:t>
+            </w:r>
+          </w:p>
+        </w:tc>
+        <w:tc>
+          <w:tcPr>
+            <w:tcW w:type="dxa" w:w="6626"/>
+            <w:tcBorders>
+              <w:top w:val="none" w:color="FFFFFF" w:sz="0"/>
+              <w:left w:val="none" w:color="FFFFFF" w:sz="0"/>
+              <w:bottom w:val="single" w:color="BFBFBF" w:sz="4"/>
+              <w:right w:val="none" w:color="FFFFFF" w:sz="0"/>
+            </w:tcBorders>
+            <w:tcMar>
+              <w:top w:type="dxa" w:w="70"/>
+              <w:left w:type="dxa" w:w="110"/>
+              <w:bottom w:type="dxa" w:w="70"/>
+              <w:right w:type="dxa" w:w="110"/>
+            </w:tcMar>
+          </w:tcPr>
+          <w:p>
+            <w:pPr>
+              <w:spacing w:after="0" w:line="260"/>
+            </w:pPr>
+            <w:r>
+              <w:rPr>
+                <w:rFonts w:ascii="Calibri" w:cs="Calibri" w:eastAsia="Calibri" w:hAnsi="Calibri"/>
+                <w:b w:val="false"/>
+                <w:bCs w:val="false"/>
+                <w:color w:val="444444"/>
+                <w:sz w:val="18"/>
+                <w:szCs w:val="18"/>
+              </w:rPr>
+              <w:t xml:space="preserve">Kupiec and Christoffersen likelihood ratios; dynamic quantile on a constant, four lagged hits and, where stated, the t−1 regime indicators.</w:t>
+            </w:r>
+          </w:p>
+        </w:tc>
+      </w:tr>
+      <w:tr>
+        <w:trPr>
+          <w:cantSplit/>
+          <w:tblHeader w:val="false"/>
+        </w:trPr>
+        <w:tc>
+          <w:tcPr>
+            <w:tcW w:type="dxa" w:w="2400"/>
+            <w:tcBorders>
+              <w:top w:val="none" w:color="FFFFFF" w:sz="0"/>
+              <w:left w:val="none" w:color="FFFFFF" w:sz="0"/>
+              <w:bottom w:val="single" w:color="BFBFBF" w:sz="4"/>
+              <w:right w:val="none" w:color="FFFFFF" w:sz="0"/>
+            </w:tcBorders>
+            <w:tcMar>
+              <w:top w:type="dxa" w:w="70"/>
+              <w:left w:type="dxa" w:w="110"/>
+              <w:bottom w:type="dxa" w:w="70"/>
+              <w:right w:type="dxa" w:w="110"/>
+            </w:tcMar>
+          </w:tcPr>
+          <w:p>
+            <w:pPr>
+              <w:spacing w:after="0" w:line="260"/>
+            </w:pPr>
+            <w:r>
+              <w:rPr>
+                <w:rFonts w:ascii="Calibri" w:cs="Calibri" w:eastAsia="Calibri" w:hAnsi="Calibri"/>
+                <w:b w:val="false"/>
+                <w:bCs w:val="false"/>
+                <w:color w:val="444444"/>
+                <w:sz w:val="18"/>
+                <w:szCs w:val="18"/>
+              </w:rPr>
+              <w:t xml:space="preserve">Multiplicity</w:t>
+            </w:r>
+          </w:p>
+        </w:tc>
+        <w:tc>
+          <w:tcPr>
+            <w:tcW w:type="dxa" w:w="6626"/>
+            <w:tcBorders>
+              <w:top w:val="none" w:color="FFFFFF" w:sz="0"/>
+              <w:left w:val="none" w:color="FFFFFF" w:sz="0"/>
+              <w:bottom w:val="single" w:color="BFBFBF" w:sz="4"/>
+              <w:right w:val="none" w:color="FFFFFF" w:sz="0"/>
+            </w:tcBorders>
+            <w:tcMar>
+              <w:top w:type="dxa" w:w="70"/>
+              <w:left w:type="dxa" w:w="110"/>
+              <w:bottom w:type="dxa" w:w="70"/>
+              <w:right w:type="dxa" w:w="110"/>
+            </w:tcMar>
+          </w:tcPr>
+          <w:p>
+            <w:pPr>
+              <w:spacing w:after="0" w:line="260"/>
+            </w:pPr>
+            <w:r>
+              <w:rPr>
+                <w:rFonts w:ascii="Calibri" w:cs="Calibri" w:eastAsia="Calibri" w:hAnsi="Calibri"/>
+                <w:b w:val="false"/>
+                <w:bCs w:val="false"/>
+                <w:color w:val="444444"/>
+                <w:sz w:val="18"/>
+                <w:szCs w:val="18"/>
+              </w:rPr>
+              <w:t xml:space="preserve">Holm within each family of method, level and tail, the size of the family reported on every row.</w:t>
+            </w:r>
+          </w:p>
+        </w:tc>
+      </w:tr>
+      <w:tr>
+        <w:trPr>
+          <w:cantSplit/>
+          <w:tblHeader w:val="false"/>
+        </w:trPr>
+        <w:tc>
+          <w:tcPr>
+            <w:tcW w:type="dxa" w:w="2400"/>
+            <w:tcBorders>
+              <w:top w:val="none" w:color="FFFFFF" w:sz="0"/>
+              <w:left w:val="none" w:color="FFFFFF" w:sz="0"/>
+              <w:bottom w:val="single" w:color="BFBFBF" w:sz="4"/>
+              <w:right w:val="none" w:color="FFFFFF" w:sz="0"/>
+            </w:tcBorders>
+            <w:tcMar>
+              <w:top w:type="dxa" w:w="70"/>
+              <w:left w:type="dxa" w:w="110"/>
+              <w:bottom w:type="dxa" w:w="70"/>
+              <w:right w:type="dxa" w:w="110"/>
+            </w:tcMar>
+          </w:tcPr>
+          <w:p>
+            <w:pPr>
+              <w:spacing w:after="0" w:line="260"/>
+            </w:pPr>
+            <w:r>
+              <w:rPr>
+                <w:rFonts w:ascii="Calibri" w:cs="Calibri" w:eastAsia="Calibri" w:hAnsi="Calibri"/>
+                <w:b w:val="false"/>
+                <w:bCs w:val="false"/>
+                <w:color w:val="444444"/>
+                <w:sz w:val="18"/>
+                <w:szCs w:val="18"/>
+              </w:rPr>
+              <w:t xml:space="preserve">Conditioning timing</w:t>
+            </w:r>
+          </w:p>
+        </w:tc>
+        <w:tc>
+          <w:tcPr>
+            <w:tcW w:type="dxa" w:w="6626"/>
+            <w:tcBorders>
+              <w:top w:val="none" w:color="FFFFFF" w:sz="0"/>
+              <w:left w:val="none" w:color="FFFFFF" w:sz="0"/>
+              <w:bottom w:val="single" w:color="BFBFBF" w:sz="4"/>
+              <w:right w:val="none" w:color="FFFFFF" w:sz="0"/>
+            </w:tcBorders>
+            <w:tcMar>
+              <w:top w:type="dxa" w:w="70"/>
+              <w:left w:type="dxa" w:w="110"/>
+              <w:bottom w:type="dxa" w:w="70"/>
+              <w:right w:type="dxa" w:w="110"/>
+            </w:tcMar>
+          </w:tcPr>
+          <w:p>
+            <w:pPr>
+              <w:spacing w:after="0" w:line="260"/>
+            </w:pPr>
+            <w:r>
+              <w:rPr>
+                <w:rFonts w:ascii="Calibri" w:cs="Calibri" w:eastAsia="Calibri" w:hAnsi="Calibri"/>
+                <w:b w:val="false"/>
+                <w:bCs w:val="false"/>
+                <w:color w:val="444444"/>
+                <w:sz w:val="18"/>
+                <w:szCs w:val="18"/>
+              </w:rPr>
+              <w:t xml:space="preserve">Every conditional statistic buckets on the t−1 filtered state, and every regressor entering a conditional test is lagged to that same information set.</w:t>
+            </w:r>
+          </w:p>
+        </w:tc>
+      </w:tr>
+      <w:tr>
+        <w:trPr>
+          <w:cantSplit/>
+          <w:tblHeader w:val="false"/>
+        </w:trPr>
+        <w:tc>
+          <w:tcPr>
+            <w:tcW w:type="dxa" w:w="2400"/>
+            <w:tcBorders>
+              <w:top w:val="none" w:color="FFFFFF" w:sz="0"/>
+              <w:left w:val="none" w:color="FFFFFF" w:sz="0"/>
+              <w:bottom w:val="single" w:color="BFBFBF" w:sz="4"/>
+              <w:right w:val="none" w:color="FFFFFF" w:sz="0"/>
+            </w:tcBorders>
+            <w:tcMar>
+              <w:top w:type="dxa" w:w="70"/>
+              <w:left w:type="dxa" w:w="110"/>
+              <w:bottom w:type="dxa" w:w="70"/>
+              <w:right w:type="dxa" w:w="110"/>
+            </w:tcMar>
+          </w:tcPr>
+          <w:p>
+            <w:pPr>
+              <w:spacing w:after="0" w:line="260"/>
+            </w:pPr>
+            <w:r>
+              <w:rPr>
+                <w:rFonts w:ascii="Calibri" w:cs="Calibri" w:eastAsia="Calibri" w:hAnsi="Calibri"/>
+                <w:b w:val="false"/>
+                <w:bCs w:val="false"/>
+                <w:color w:val="444444"/>
+                <w:sz w:val="18"/>
+                <w:szCs w:val="18"/>
+              </w:rPr>
+              <w:t xml:space="preserve">Uncertainty sampling</w:t>
+            </w:r>
+          </w:p>
+        </w:tc>
+        <w:tc>
+          <w:tcPr>
+            <w:tcW w:type="dxa" w:w="6626"/>
+            <w:tcBorders>
+              <w:top w:val="none" w:color="FFFFFF" w:sz="0"/>
+              <w:left w:val="none" w:color="FFFFFF" w:sz="0"/>
+              <w:bottom w:val="single" w:color="BFBFBF" w:sz="4"/>
+              <w:right w:val="none" w:color="FFFFFF" w:sz="0"/>
+            </w:tcBorders>
+            <w:tcMar>
+              <w:top w:type="dxa" w:w="70"/>
+              <w:left w:type="dxa" w:w="110"/>
+              <w:bottom w:type="dxa" w:w="70"/>
+              <w:right w:type="dxa" w:w="110"/>
+            </w:tcMar>
+          </w:tcPr>
+          <w:p>
+            <w:pPr>
+              <w:spacing w:after="0" w:line="260"/>
+            </w:pPr>
+            <w:r>
+              <w:rPr>
+                <w:rFonts w:ascii="Calibri" w:cs="Calibri" w:eastAsia="Calibri" w:hAnsi="Calibri"/>
+                <w:b w:val="false"/>
+                <w:bCs w:val="false"/>
+                <w:color w:val="444444"/>
+                <w:sz w:val="18"/>
+                <w:szCs w:val="18"/>
+              </w:rPr>
+              <w:t xml:space="preserve">100 Monte Carlo dropout passes with mask seed 17; the quantile head trained at the 5th, 50th and 95th percentiles.</w:t>
+            </w:r>
+          </w:p>
+        </w:tc>
+      </w:tr>
+      <w:tr>
+        <w:trPr>
+          <w:cantSplit/>
+          <w:tblHeader w:val="false"/>
+        </w:trPr>
+        <w:tc>
+          <w:tcPr>
+            <w:tcW w:type="dxa" w:w="2400"/>
+            <w:tcBorders>
+              <w:top w:val="none" w:color="FFFFFF" w:sz="0"/>
+              <w:left w:val="none" w:color="FFFFFF" w:sz="0"/>
+              <w:bottom w:val="single" w:color="BFBFBF" w:sz="4"/>
+              <w:right w:val="none" w:color="FFFFFF" w:sz="0"/>
+            </w:tcBorders>
+            <w:tcMar>
+              <w:top w:type="dxa" w:w="70"/>
+              <w:left w:type="dxa" w:w="110"/>
+              <w:bottom w:type="dxa" w:w="70"/>
+              <w:right w:type="dxa" w:w="110"/>
+            </w:tcMar>
+          </w:tcPr>
+          <w:p>
+            <w:pPr>
+              <w:spacing w:after="0" w:line="260"/>
+            </w:pPr>
+            <w:r>
+              <w:rPr>
+                <w:rFonts w:ascii="Calibri" w:cs="Calibri" w:eastAsia="Calibri" w:hAnsi="Calibri"/>
+                <w:b w:val="false"/>
+                <w:bCs w:val="false"/>
+                <w:color w:val="444444"/>
+                <w:sz w:val="18"/>
+                <w:szCs w:val="18"/>
+              </w:rPr>
+              <w:t xml:space="preserve">Reproducibility</w:t>
+            </w:r>
+          </w:p>
+        </w:tc>
+        <w:tc>
+          <w:tcPr>
+            <w:tcW w:type="dxa" w:w="6626"/>
+            <w:tcBorders>
+              <w:top w:val="none" w:color="FFFFFF" w:sz="0"/>
+              <w:left w:val="none" w:color="FFFFFF" w:sz="0"/>
+              <w:bottom w:val="single" w:color="BFBFBF" w:sz="4"/>
+              <w:right w:val="none" w:color="FFFFFF" w:sz="0"/>
+            </w:tcBorders>
+            <w:tcMar>
+              <w:top w:type="dxa" w:w="70"/>
+              <w:left w:type="dxa" w:w="110"/>
+              <w:bottom w:type="dxa" w:w="70"/>
+              <w:right w:type="dxa" w:w="110"/>
+            </w:tcMar>
+          </w:tcPr>
+          <w:p>
+            <w:pPr>
+              <w:spacing w:after="0" w:line="260"/>
+            </w:pPr>
+            <w:r>
+              <w:rPr>
+                <w:rFonts w:ascii="Calibri" w:cs="Calibri" w:eastAsia="Calibri" w:hAnsi="Calibri"/>
+                <w:b w:val="false"/>
+                <w:bCs w:val="false"/>
+                <w:color w:val="444444"/>
+                <w:sz w:val="18"/>
+                <w:szCs w:val="18"/>
+              </w:rPr>
+              <w:t xml:space="preserve">Seed 17 for every stochastic component; each run writes its resolved configuration and library versions beside its outputs.</w:t>
+            </w:r>
+          </w:p>
+        </w:tc>
+      </w:tr>
+    </w:tbl>
+    <w:p>
+      <w:pPr>
+        <w:spacing w:after="90" w:before="200"/>
+      </w:pPr>
+      <w:r>
+        <w:rPr>
+          <w:rFonts w:ascii="Calibri" w:cs="Calibri" w:eastAsia="Calibri" w:hAnsi="Calibri"/>
+          <w:b/>
+          <w:bCs/>
+          <w:color w:val="111111"/>
+          <w:sz w:val="19"/>
+          <w:szCs w:val="19"/>
+        </w:rPr>
+        <w:t>Table A.5  Minimum computational requirements, derived from the architectures of Section 3.4.</w:t>
       </w:r>
     </w:p>
     <w:tbl>

</xml_diff>